<commit_message>
Split the doc's trust table by measure family too
Match the detection report: the trust table now has a similarity column
(reference-based BLEU/CodeBLEU family) alongside the structural one, so
the four structural blind spots read as invisible-to-structure rather
than undetectable. Add a paragraph making the two-family point and
pointing to the existing reference caveat.
</commit_message>
<xml_diff>
--- a/docs/Code Smells Research Kai v4.docx
+++ b/docs/Code Smells Research Kai v4.docx
@@ -7134,15 +7134,12 @@
       </w:r>
       <w:proofErr w:type="spellStart"/>
       <w:r>
+        <w:lastRenderedPageBreak/>
         <w:t>pylint</w:t>
       </w:r>
       <w:proofErr w:type="spellEnd"/>
       <w:r>
-        <w:t xml:space="preserve"> reports this line only as a magic-value comparison (R2004): it treats the underscore as a deliberate throwaway and does not raise an unused-variable warning (W0612). The same line written with an ordinary name (`x = n == 42`) is flagged as both a magic value (R2004) </w:t>
-      </w:r>
-      <w:r>
-        <w:lastRenderedPageBreak/>
-        <w:t>and an unused variable (W0612), and the build's collateral filter would drop such a two-smell sample. The underscore therefore keeps the injection to exactly one detector-confirmed smell — which every injected pair in the benchmark requires.</w:t>
+        <w:t xml:space="preserve"> reports this line only as a magic-value comparison (R2004): it treats the underscore as a deliberate throwaway and does not raise an unused-variable warning (W0612). The same line written with an ordinary name (`x = n == 42`) is flagged as both a magic value (R2004) and an unused variable (W0612), and the build's collateral filter would drop such a two-smell sample. The underscore therefore keeps the injection to exactly one detector-confirmed smell — which every injected pair in the benchmark requires.</w:t>
       </w:r>
     </w:p>
     <w:p/>
@@ -7400,6 +7397,7 @@
           <w:p>
             <w:proofErr w:type="gramStart"/>
             <w:r>
+              <w:lastRenderedPageBreak/>
               <w:t>Natural-language</w:t>
             </w:r>
             <w:proofErr w:type="gramEnd"/>
@@ -7449,7 +7447,6 @@
     <w:p/>
     <w:p>
       <w:r>
-        <w:lastRenderedPageBreak/>
         <w:t>The tool is validated on the injected pairs, where the answer is known. Every measure is run on both the clean and the smelly version of each pair, and we check whether the measure moves the 'worse' way when a smell is added. The two groups are read slightly differently: the structural measures give a real score to each side and are compared directly; the similarity measures score the code against its clean twin, which is a perfect 100 by definition, so we look at how far the smell drags that score down. A single 'detection strength' score is also computed so that every measure can be compared on one scale.</w:t>
       </w:r>
     </w:p>
@@ -7806,6 +7803,7 @@
           <w:p>
             <w:proofErr w:type="spellStart"/>
             <w:r>
+              <w:lastRenderedPageBreak/>
               <w:t>eval_tool</w:t>
             </w:r>
             <w:proofErr w:type="spellEnd"/>
@@ -7859,7 +7857,6 @@
         <w:pStyle w:val="Heading2"/>
       </w:pPr>
       <w:r>
-        <w:lastRenderedPageBreak/>
         <w:t>5. How to Read the Results</w:t>
       </w:r>
     </w:p>
@@ -7975,7 +7972,11 @@
         <w:t>This is data contamination.</w:t>
       </w:r>
       <w:r>
-        <w:t xml:space="preserve"> It means Qwen may reproduce something close to the canonical solution, so its code could look cleaner and more similar-to-reference than it would on tasks it had never seen. </w:t>
+        <w:t xml:space="preserve"> It means Qwen may reproduce something close to the canonical solution, so its code could look cleaner and more similar-to-reference than it </w:t>
+      </w:r>
+      <w:r>
+        <w:lastRenderedPageBreak/>
+        <w:t xml:space="preserve">would on tasks it had never seen. </w:t>
       </w:r>
       <w:r>
         <w:t>W</w:t>
@@ -8009,115 +8010,118 @@
         <w:pStyle w:val="Heading2"/>
       </w:pPr>
       <w:r>
+        <w:t>Reading the model's smell distribution</w:t>
+      </w:r>
+    </w:p>
+    <w:p>
+      <w:pPr>
+        <w:jc w:val="both"/>
+      </w:pPr>
+      <w:r>
+        <w:t>The twelve smells were chosen, from the literature, as ones empirically common in LLM-generated code — that was one of the selection criteria. The benchmark holds a balanced hundred examples of each, both to validate the measures and because these are the smells we expect to matter for LLM output. The model evaluation is the complementary step: it points the validated tool at real generations and asks what the model actually writes.</w:t>
+      </w:r>
+    </w:p>
+    <w:p>
+      <w:pPr>
+        <w:jc w:val="both"/>
+      </w:pPr>
+      <w:r>
+        <w:t xml:space="preserve">On the Qwen generations only four of the twelve appear at all, dominated by magic numbers. This looks like it contradicts the selection criterion, but the two are at different scopes: the criterion describes LLM code in general, drawn from studies of realistic generation, whereas this evaluation uses a small model on MBPP and </w:t>
+      </w:r>
+      <w:proofErr w:type="spellStart"/>
+      <w:r>
+        <w:t>HumanEval</w:t>
+      </w:r>
+      <w:proofErr w:type="spellEnd"/>
+      <w:r>
+        <w:t xml:space="preserve"> — single short functions. Those tasks cannot physically exhibit the smells that only emerge at scale, such as a long method, deep nesting, or code duplicated across functions. Duplicate code is the clearest case: an across-unit smell that scoring one isolated function at a time can almost never reveal.</w:t>
+      </w:r>
+    </w:p>
+    <w:p>
+      <w:pPr>
+        <w:jc w:val="both"/>
+      </w:pPr>
+      <w:r>
+        <w:t xml:space="preserve">So, the </w:t>
+      </w:r>
+      <w:proofErr w:type="gramStart"/>
+      <w:r>
+        <w:t>near-absence</w:t>
+      </w:r>
+      <w:proofErr w:type="gramEnd"/>
+      <w:r>
+        <w:t xml:space="preserve"> is a limitation of the evaluation's scope, not evidence that the smells were poorly chosen or that the model writes clean code. If anything it sharpens the point: because these smells were selected precisely for being common in LLM output, a test that cannot surface them is under-powered for the phenomenon we set out to study. Observing the fuller distribution in practice would mean evaluating the model on larger, more realistic generation tasks rather than single short functions.</w:t>
+      </w:r>
+    </w:p>
+    <w:p>
+      <w:pPr>
+        <w:jc w:val="both"/>
+      </w:pPr>
+      <w:r>
+        <w:t>There is external support for this reading. Velasco</w:t>
+      </w:r>
+      <w:r>
+        <w:t>’s paper</w:t>
+      </w:r>
+      <w:r>
+        <w:t xml:space="preserve"> (</w:t>
+      </w:r>
+      <w:proofErr w:type="spellStart"/>
+      <w:r>
+        <w:t>CodeSmellEval</w:t>
+      </w:r>
+      <w:proofErr w:type="spellEnd"/>
+      <w:r>
+        <w:t xml:space="preserve">, 2025), from the same group as one of the datasets reused here, measured how prone two seven-billion-parameter models </w:t>
+      </w:r>
+      <w:r>
+        <w:t>(</w:t>
+      </w:r>
+      <w:proofErr w:type="spellStart"/>
+      <w:r>
+        <w:t>CodeLlama</w:t>
+      </w:r>
+      <w:proofErr w:type="spellEnd"/>
+      <w:r>
+        <w:t xml:space="preserve"> and Mistral</w:t>
+      </w:r>
+      <w:r>
+        <w:t xml:space="preserve">) </w:t>
+      </w:r>
+      <w:r>
+        <w:t xml:space="preserve">are to producing thirteen Pylint smells. Rather than generate code and inspect it, they fed the models existing smelly methods from GitHub and read off the probability each model assigned to the smelly tokens — a propensity score they call PSC, which captures a tendency to produce a smell rather than its appearance in generated output. Ten of the thirteen smells scored above their threshold, and the strongest included broad-exception-caught, too-many-nested-blocks, and too-many-boolean-expressions — our broad_except, deep_nesting, and complex_conditional, the very smells absent from the Qwen generations. </w:t>
+      </w:r>
+      <w:r>
+        <w:t>“Too</w:t>
+      </w:r>
+      <w:r>
+        <w:t>-many-arguments</w:t>
+      </w:r>
+      <w:r>
+        <w:t>” was a smell that was found to be rarely produced. Similarly,</w:t>
+      </w:r>
+      <w:r>
+        <w:t xml:space="preserve"> our </w:t>
+      </w:r>
+      <w:proofErr w:type="spellStart"/>
+      <w:r>
+        <w:t>long_parameter_list</w:t>
+      </w:r>
+      <w:proofErr w:type="spellEnd"/>
+      <w:r>
+        <w:t>, fell below their threshold and appeared just once in ours.</w:t>
+      </w:r>
+    </w:p>
+    <w:p>
+      <w:pPr>
+        <w:jc w:val="both"/>
+      </w:pPr>
+      <w:r>
+        <w:t xml:space="preserve">So the smells our short-function evaluation never surfaces are ones a probability-level probe shows the models are strongly inclined to produce. The difference is what each method measures: their score captures a latent tendency on code that already contains a smell, while our evaluation captures what actually appears when the model writes a full solution to a short task. The authors are explicit that these are different questions — they note that their score is computed from already-smelly code, and that “another study is needed to determine whether a </w:t>
+      </w:r>
+      <w:r>
         <w:lastRenderedPageBreak/>
-        <w:t>Reading the model's smell distribution</w:t>
-      </w:r>
-    </w:p>
-    <w:p>
-      <w:pPr>
-        <w:jc w:val="both"/>
-      </w:pPr>
-      <w:r>
-        <w:t>The twelve smells were chosen, from the literature, as ones empirically common in LLM-generated code — that was one of the selection criteria. The benchmark holds a balanced hundred examples of each, both to validate the measures and because these are the smells we expect to matter for LLM output. The model evaluation is the complementary step: it points the validated tool at real generations and asks what the model actually writes.</w:t>
-      </w:r>
-    </w:p>
-    <w:p>
-      <w:pPr>
-        <w:jc w:val="both"/>
-      </w:pPr>
-      <w:r>
-        <w:t xml:space="preserve">On the Qwen generations only four of the twelve appear at all, dominated by magic numbers. This looks like it contradicts the selection criterion, but the two are at different scopes: the criterion describes LLM code in general, drawn from studies of realistic generation, whereas this evaluation uses a small model on MBPP and </w:t>
-      </w:r>
-      <w:proofErr w:type="spellStart"/>
-      <w:r>
-        <w:t>HumanEval</w:t>
-      </w:r>
-      <w:proofErr w:type="spellEnd"/>
-      <w:r>
-        <w:t xml:space="preserve"> — single short functions. Those tasks cannot physically exhibit the smells that only emerge at scale, such as a long method, deep nesting, or code duplicated across functions. Duplicate code is the clearest case: an across-unit smell that scoring one isolated function at a time can almost never reveal.</w:t>
-      </w:r>
-    </w:p>
-    <w:p>
-      <w:pPr>
-        <w:jc w:val="both"/>
-      </w:pPr>
-      <w:r>
-        <w:t xml:space="preserve">So, the </w:t>
-      </w:r>
-      <w:proofErr w:type="gramStart"/>
-      <w:r>
-        <w:t>near-absence</w:t>
-      </w:r>
-      <w:proofErr w:type="gramEnd"/>
-      <w:r>
-        <w:t xml:space="preserve"> is a limitation of the evaluation's scope, not evidence that the smells were poorly chosen or that the model writes clean code. If anything it sharpens the point: because these smells were selected precisely for being common in LLM output, a test that cannot surface them is under-powered for the phenomenon we set out to study. Observing the fuller distribution in practice would mean evaluating the model on larger, more realistic generation tasks rather than single short functions.</w:t>
-      </w:r>
-    </w:p>
-    <w:p>
-      <w:pPr>
-        <w:jc w:val="both"/>
-      </w:pPr>
-      <w:r>
-        <w:t>There is external support for this reading. Velasco</w:t>
-      </w:r>
-      <w:r>
-        <w:t>’s paper</w:t>
-      </w:r>
-      <w:r>
-        <w:t xml:space="preserve"> (</w:t>
-      </w:r>
-      <w:proofErr w:type="spellStart"/>
-      <w:r>
-        <w:t>CodeSmellEval</w:t>
-      </w:r>
-      <w:proofErr w:type="spellEnd"/>
-      <w:r>
-        <w:t xml:space="preserve">, 2025), from the same group as one of the datasets reused here, measured how prone two seven-billion-parameter models </w:t>
-      </w:r>
-      <w:r>
-        <w:t>(</w:t>
-      </w:r>
-      <w:proofErr w:type="spellStart"/>
-      <w:r>
-        <w:t>CodeLlama</w:t>
-      </w:r>
-      <w:proofErr w:type="spellEnd"/>
-      <w:r>
-        <w:t xml:space="preserve"> and Mistral</w:t>
-      </w:r>
-      <w:r>
-        <w:t xml:space="preserve">) </w:t>
-      </w:r>
-      <w:r>
-        <w:t xml:space="preserve">are to producing thirteen Pylint smells. Rather than generate code and inspect it, they fed the models existing smelly methods from GitHub and read off the probability each model assigned to the smelly tokens — a propensity score they call PSC, which captures a tendency to produce a smell rather than its appearance in generated output. Ten of the thirteen smells scored above their threshold, and the strongest included broad-exception-caught, too-many-nested-blocks, and too-many-boolean-expressions — our broad_except, deep_nesting, and complex_conditional, the very smells absent from the Qwen generations. </w:t>
-      </w:r>
-      <w:r>
-        <w:t>“Too</w:t>
-      </w:r>
-      <w:r>
-        <w:t>-many-arguments</w:t>
-      </w:r>
-      <w:r>
-        <w:t>” was a smell that was found to be rarely produced. Similarly,</w:t>
-      </w:r>
-      <w:r>
-        <w:t xml:space="preserve"> our </w:t>
-      </w:r>
-      <w:proofErr w:type="spellStart"/>
-      <w:r>
-        <w:t>long_parameter_list</w:t>
-      </w:r>
-      <w:proofErr w:type="spellEnd"/>
-      <w:r>
-        <w:t>, fell below their threshold and appeared just once in ours.</w:t>
-      </w:r>
-    </w:p>
-    <w:p>
-      <w:pPr>
-        <w:jc w:val="both"/>
-      </w:pPr>
-      <w:r>
-        <w:t>So the smells our short-function evaluation never surfaces are ones a probability-level probe shows the models are strongly inclined to produce. The difference is what each method measures: their score captures a latent tendency on code that already contains a smell, while our evaluation captures what actually appears when the model writes a full solution to a short task. The authors are explicit that these are different questions — they note that their score is computed from already-smelly code, and that “another study is needed to determine whether a correlation exists between PSC scores and the overall quality of the code generated by LLMs.” Measuring the quality of freely generated code is the question they leave open, and it is the one this evaluation answers.</w:t>
+        <w:t>correlation exists between PSC scores and the overall quality of the code generated by LLMs.” Measuring the quality of freely generated code is the question they leave open, and it is the one this evaluation answers.</w:t>
       </w:r>
     </w:p>
     <w:p/>
@@ -8126,7 +8130,6 @@
         <w:pStyle w:val="Heading2"/>
       </w:pPr>
       <w:r>
-        <w:lastRenderedPageBreak/>
         <w:t>What We Know About the Metrics So Far</w:t>
       </w:r>
     </w:p>
@@ -8323,24 +8326,26 @@
     </w:p>
     <w:p>
       <w:r>
-        <w:t>Applying this across all twelve smells (each now has real-world data except that inefficient copy and duplicate code are sampled thinly) gives the following picture of which structural measures can be trusted:</w:t>
+        <w:t>Applying this across all twelve smells (each now has real-world data except that inefficient copy and duplicate code are sampled thinly) gives the following picture of which measures can be trusted, split by family:</w:t>
       </w:r>
     </w:p>
     <w:tbl>
       <w:tblPr>
         <w:tblStyle w:val="TableGrid"/>
         <w:tblW w:w="0" w:type="auto"/>
+        <w:tblLayout w:type="fixed"/>
         <w:tblLook w:val="04A0" w:firstRow="1" w:lastRow="0" w:firstColumn="1" w:lastColumn="0" w:noHBand="0" w:noVBand="1"/>
       </w:tblPr>
       <w:tblGrid>
-        <w:gridCol w:w="3005"/>
-        <w:gridCol w:w="3005"/>
-        <w:gridCol w:w="3006"/>
+        <w:gridCol w:w="1803"/>
+        <w:gridCol w:w="2073"/>
+        <w:gridCol w:w="2073"/>
+        <w:gridCol w:w="3065"/>
       </w:tblGrid>
       <w:tr>
         <w:tc>
           <w:tcPr>
-            <w:tcW w:w="3009" w:type="dxa"/>
+            <w:tcW w:w="1803" w:type="dxa"/>
           </w:tcPr>
           <w:p>
             <w:r>
@@ -8353,27 +8358,40 @@
         </w:tc>
         <w:tc>
           <w:tcPr>
-            <w:tcW w:w="3009" w:type="dxa"/>
+            <w:tcW w:w="2073" w:type="dxa"/>
           </w:tcPr>
           <w:p>
             <w:r>
               <w:rPr>
                 <w:b/>
               </w:rPr>
-              <w:t>Structural detectability (real)</w:t>
-            </w:r>
-          </w:p>
-        </w:tc>
-        <w:tc>
-          <w:tcPr>
-            <w:tcW w:w="3009" w:type="dxa"/>
+              <w:t>Structural (reference-free)</w:t>
+            </w:r>
+          </w:p>
+        </w:tc>
+        <w:tc>
+          <w:tcPr>
+            <w:tcW w:w="2073" w:type="dxa"/>
           </w:tcPr>
           <w:p>
             <w:r>
               <w:rPr>
                 <w:b/>
               </w:rPr>
-              <w:t>Use</w:t>
+              <w:t>Similarity (vs. reference)</w:t>
+            </w:r>
+          </w:p>
+        </w:tc>
+        <w:tc>
+          <w:tcPr>
+            <w:tcW w:w="3065" w:type="dxa"/>
+          </w:tcPr>
+          <w:p>
+            <w:r>
+              <w:rPr>
+                <w:b/>
+              </w:rPr>
+              <w:t>What to rely on</w:t>
             </w:r>
           </w:p>
         </w:tc>
@@ -8381,7 +8399,7 @@
       <w:tr>
         <w:tc>
           <w:tcPr>
-            <w:tcW w:w="3009" w:type="dxa"/>
+            <w:tcW w:w="1803" w:type="dxa"/>
           </w:tcPr>
           <w:p>
             <w:r>
@@ -8391,7 +8409,7 @@
         </w:tc>
         <w:tc>
           <w:tcPr>
-            <w:tcW w:w="3009" w:type="dxa"/>
+            <w:tcW w:w="2073" w:type="dxa"/>
           </w:tcPr>
           <w:p>
             <w:r>
@@ -8401,11 +8419,21 @@
         </w:tc>
         <w:tc>
           <w:tcPr>
-            <w:tcW w:w="3009" w:type="dxa"/>
-          </w:tcPr>
-          <w:p>
-            <w:r>
-              <w:t>maintainability, cyclomatic, SLOC, Halstead</w:t>
+            <w:tcW w:w="2073" w:type="dxa"/>
+          </w:tcPr>
+          <w:p>
+            <w:r>
+              <w:t>Strong</w:t>
+            </w:r>
+          </w:p>
+        </w:tc>
+        <w:tc>
+          <w:tcPr>
+            <w:tcW w:w="3065" w:type="dxa"/>
+          </w:tcPr>
+          <w:p>
+            <w:r>
+              <w:t>any structural measure</w:t>
             </w:r>
           </w:p>
         </w:tc>
@@ -8413,7 +8441,7 @@
       <w:tr>
         <w:tc>
           <w:tcPr>
-            <w:tcW w:w="3009" w:type="dxa"/>
+            <w:tcW w:w="1803" w:type="dxa"/>
           </w:tcPr>
           <w:p>
             <w:r>
@@ -8423,7 +8451,7 @@
         </w:tc>
         <w:tc>
           <w:tcPr>
-            <w:tcW w:w="3009" w:type="dxa"/>
+            <w:tcW w:w="2073" w:type="dxa"/>
           </w:tcPr>
           <w:p>
             <w:r>
@@ -8433,11 +8461,21 @@
         </w:tc>
         <w:tc>
           <w:tcPr>
-            <w:tcW w:w="3009" w:type="dxa"/>
-          </w:tcPr>
-          <w:p>
-            <w:r>
-              <w:t>all structural measures</w:t>
+            <w:tcW w:w="2073" w:type="dxa"/>
+          </w:tcPr>
+          <w:p>
+            <w:r>
+              <w:t>Strong</w:t>
+            </w:r>
+          </w:p>
+        </w:tc>
+        <w:tc>
+          <w:tcPr>
+            <w:tcW w:w="3065" w:type="dxa"/>
+          </w:tcPr>
+          <w:p>
+            <w:r>
+              <w:t>cyclomatic, SLOC</w:t>
             </w:r>
           </w:p>
         </w:tc>
@@ -8445,7 +8483,7 @@
       <w:tr>
         <w:tc>
           <w:tcPr>
-            <w:tcW w:w="3009" w:type="dxa"/>
+            <w:tcW w:w="1803" w:type="dxa"/>
           </w:tcPr>
           <w:p>
             <w:r>
@@ -8455,7 +8493,7 @@
         </w:tc>
         <w:tc>
           <w:tcPr>
-            <w:tcW w:w="3009" w:type="dxa"/>
+            <w:tcW w:w="2073" w:type="dxa"/>
           </w:tcPr>
           <w:p>
             <w:r>
@@ -8465,11 +8503,21 @@
         </w:tc>
         <w:tc>
           <w:tcPr>
-            <w:tcW w:w="3009" w:type="dxa"/>
-          </w:tcPr>
-          <w:p>
-            <w:r>
-              <w:t>all structural measures</w:t>
+            <w:tcW w:w="2073" w:type="dxa"/>
+          </w:tcPr>
+          <w:p>
+            <w:r>
+              <w:t>Strong</w:t>
+            </w:r>
+          </w:p>
+        </w:tc>
+        <w:tc>
+          <w:tcPr>
+            <w:tcW w:w="3065" w:type="dxa"/>
+          </w:tcPr>
+          <w:p>
+            <w:r>
+              <w:t>cyclomatic</w:t>
             </w:r>
           </w:p>
         </w:tc>
@@ -8477,31 +8525,41 @@
       <w:tr>
         <w:tc>
           <w:tcPr>
-            <w:tcW w:w="3009" w:type="dxa"/>
-          </w:tcPr>
-          <w:p>
-            <w:r>
-              <w:t>Inefficient copy</w:t>
-            </w:r>
-          </w:p>
-        </w:tc>
-        <w:tc>
-          <w:tcPr>
-            <w:tcW w:w="3009" w:type="dxa"/>
-          </w:tcPr>
-          <w:p>
-            <w:r>
-              <w:t>Moderate (co-occurrence)</w:t>
-            </w:r>
-          </w:p>
-        </w:tc>
-        <w:tc>
-          <w:tcPr>
-            <w:tcW w:w="3009" w:type="dxa"/>
-          </w:tcPr>
-          <w:p>
-            <w:r>
-              <w:t>cyclomatic, maintainability</w:t>
+            <w:tcW w:w="1803" w:type="dxa"/>
+          </w:tcPr>
+          <w:p>
+            <w:r>
+              <w:t>Broad except</w:t>
+            </w:r>
+          </w:p>
+        </w:tc>
+        <w:tc>
+          <w:tcPr>
+            <w:tcW w:w="2073" w:type="dxa"/>
+          </w:tcPr>
+          <w:p>
+            <w:r>
+              <w:t>Co-occurrence</w:t>
+            </w:r>
+          </w:p>
+        </w:tc>
+        <w:tc>
+          <w:tcPr>
+            <w:tcW w:w="2073" w:type="dxa"/>
+          </w:tcPr>
+          <w:p>
+            <w:r>
+              <w:t>Strong</w:t>
+            </w:r>
+          </w:p>
+        </w:tc>
+        <w:tc>
+          <w:tcPr>
+            <w:tcW w:w="3065" w:type="dxa"/>
+          </w:tcPr>
+          <w:p>
+            <w:r>
+              <w:t>CodeBLEU / BLEU; the detector</w:t>
             </w:r>
           </w:p>
         </w:tc>
@@ -8509,31 +8567,41 @@
       <w:tr>
         <w:tc>
           <w:tcPr>
-            <w:tcW w:w="3009" w:type="dxa"/>
-          </w:tcPr>
-          <w:p>
-            <w:r>
-              <w:t>Try inside a loop</w:t>
-            </w:r>
-          </w:p>
-        </w:tc>
-        <w:tc>
-          <w:tcPr>
-            <w:tcW w:w="3009" w:type="dxa"/>
-          </w:tcPr>
-          <w:p>
-            <w:r>
-              <w:t>Moderate (co-occurrence)</w:t>
-            </w:r>
-          </w:p>
-        </w:tc>
-        <w:tc>
-          <w:tcPr>
-            <w:tcW w:w="3009" w:type="dxa"/>
-          </w:tcPr>
-          <w:p>
-            <w:r>
-              <w:t>cyclomatic</w:t>
+            <w:tcW w:w="1803" w:type="dxa"/>
+          </w:tcPr>
+          <w:p>
+            <w:r>
+              <w:t>Magic number</w:t>
+            </w:r>
+          </w:p>
+        </w:tc>
+        <w:tc>
+          <w:tcPr>
+            <w:tcW w:w="2073" w:type="dxa"/>
+          </w:tcPr>
+          <w:p>
+            <w:r>
+              <w:t>Co-occurrence</w:t>
+            </w:r>
+          </w:p>
+        </w:tc>
+        <w:tc>
+          <w:tcPr>
+            <w:tcW w:w="2073" w:type="dxa"/>
+          </w:tcPr>
+          <w:p>
+            <w:r>
+              <w:t>Strong</w:t>
+            </w:r>
+          </w:p>
+        </w:tc>
+        <w:tc>
+          <w:tcPr>
+            <w:tcW w:w="3065" w:type="dxa"/>
+          </w:tcPr>
+          <w:p>
+            <w:r>
+              <w:t>CodeBLEU; the detector</w:t>
             </w:r>
           </w:p>
         </w:tc>
@@ -8541,31 +8609,41 @@
       <w:tr>
         <w:tc>
           <w:tcPr>
-            <w:tcW w:w="3009" w:type="dxa"/>
-          </w:tcPr>
-          <w:p>
-            <w:r>
-              <w:t>Magic number</w:t>
-            </w:r>
-          </w:p>
-        </w:tc>
-        <w:tc>
-          <w:tcPr>
-            <w:tcW w:w="3009" w:type="dxa"/>
-          </w:tcPr>
-          <w:p>
-            <w:r>
-              <w:t>Moderate (co-occurrence)</w:t>
-            </w:r>
-          </w:p>
-        </w:tc>
-        <w:tc>
-          <w:tcPr>
-            <w:tcW w:w="3009" w:type="dxa"/>
-          </w:tcPr>
-          <w:p>
-            <w:r>
-              <w:t>cyclomatic, maintainability</w:t>
+            <w:tcW w:w="1803" w:type="dxa"/>
+          </w:tcPr>
+          <w:p>
+            <w:r>
+              <w:t>Inefficient copy</w:t>
+            </w:r>
+          </w:p>
+        </w:tc>
+        <w:tc>
+          <w:tcPr>
+            <w:tcW w:w="2073" w:type="dxa"/>
+          </w:tcPr>
+          <w:p>
+            <w:r>
+              <w:t>Co-occurrence</w:t>
+            </w:r>
+          </w:p>
+        </w:tc>
+        <w:tc>
+          <w:tcPr>
+            <w:tcW w:w="2073" w:type="dxa"/>
+          </w:tcPr>
+          <w:p>
+            <w:r>
+              <w:t>Strong</w:t>
+            </w:r>
+          </w:p>
+        </w:tc>
+        <w:tc>
+          <w:tcPr>
+            <w:tcW w:w="3065" w:type="dxa"/>
+          </w:tcPr>
+          <w:p>
+            <w:r>
+              <w:t>CodeBLEU; the detector (Ruff)</w:t>
             </w:r>
           </w:p>
         </w:tc>
@@ -8573,31 +8651,41 @@
       <w:tr>
         <w:tc>
           <w:tcPr>
-            <w:tcW w:w="3009" w:type="dxa"/>
-          </w:tcPr>
-          <w:p>
-            <w:r>
-              <w:t>Broad except</w:t>
-            </w:r>
-          </w:p>
-        </w:tc>
-        <w:tc>
-          <w:tcPr>
-            <w:tcW w:w="3009" w:type="dxa"/>
-          </w:tcPr>
-          <w:p>
-            <w:r>
-              <w:t>Moderate (co-occurrence)</w:t>
-            </w:r>
-          </w:p>
-        </w:tc>
-        <w:tc>
-          <w:tcPr>
-            <w:tcW w:w="3009" w:type="dxa"/>
-          </w:tcPr>
-          <w:p>
-            <w:r>
-              <w:t>maintainability</w:t>
+            <w:tcW w:w="1803" w:type="dxa"/>
+          </w:tcPr>
+          <w:p>
+            <w:r>
+              <w:t>Inefficient loop</w:t>
+            </w:r>
+          </w:p>
+        </w:tc>
+        <w:tc>
+          <w:tcPr>
+            <w:tcW w:w="2073" w:type="dxa"/>
+          </w:tcPr>
+          <w:p>
+            <w:r>
+              <w:t>Co-occurrence</w:t>
+            </w:r>
+          </w:p>
+        </w:tc>
+        <w:tc>
+          <w:tcPr>
+            <w:tcW w:w="2073" w:type="dxa"/>
+          </w:tcPr>
+          <w:p>
+            <w:r>
+              <w:t>Strong</w:t>
+            </w:r>
+          </w:p>
+        </w:tc>
+        <w:tc>
+          <w:tcPr>
+            <w:tcW w:w="3065" w:type="dxa"/>
+          </w:tcPr>
+          <w:p>
+            <w:r>
+              <w:t>CodeBLEU; the detector (Ruff)</w:t>
             </w:r>
           </w:p>
         </w:tc>
@@ -8605,31 +8693,41 @@
       <w:tr>
         <w:tc>
           <w:tcPr>
-            <w:tcW w:w="3009" w:type="dxa"/>
-          </w:tcPr>
-          <w:p>
-            <w:r>
-              <w:t>Inefficient loop</w:t>
-            </w:r>
-          </w:p>
-        </w:tc>
-        <w:tc>
-          <w:tcPr>
-            <w:tcW w:w="3009" w:type="dxa"/>
-          </w:tcPr>
-          <w:p>
-            <w:r>
-              <w:t>Moderate (co-occurrence)</w:t>
-            </w:r>
-          </w:p>
-        </w:tc>
-        <w:tc>
-          <w:tcPr>
-            <w:tcW w:w="3009" w:type="dxa"/>
-          </w:tcPr>
-          <w:p>
-            <w:r>
-              <w:t>cyclomatic</w:t>
+            <w:tcW w:w="1803" w:type="dxa"/>
+          </w:tcPr>
+          <w:p>
+            <w:r>
+              <w:t>Try inside a loop</w:t>
+            </w:r>
+          </w:p>
+        </w:tc>
+        <w:tc>
+          <w:tcPr>
+            <w:tcW w:w="2073" w:type="dxa"/>
+          </w:tcPr>
+          <w:p>
+            <w:r>
+              <w:t>Co-occurrence</w:t>
+            </w:r>
+          </w:p>
+        </w:tc>
+        <w:tc>
+          <w:tcPr>
+            <w:tcW w:w="2073" w:type="dxa"/>
+          </w:tcPr>
+          <w:p>
+            <w:r>
+              <w:t>Strong</w:t>
+            </w:r>
+          </w:p>
+        </w:tc>
+        <w:tc>
+          <w:tcPr>
+            <w:tcW w:w="3065" w:type="dxa"/>
+          </w:tcPr>
+          <w:p>
+            <w:r>
+              <w:t>CodeBLEU / BLEU; the detector (Ruff)</w:t>
             </w:r>
           </w:p>
         </w:tc>
@@ -8637,7 +8735,7 @@
       <w:tr>
         <w:tc>
           <w:tcPr>
-            <w:tcW w:w="3009" w:type="dxa"/>
+            <w:tcW w:w="1803" w:type="dxa"/>
           </w:tcPr>
           <w:p>
             <w:r>
@@ -8647,21 +8745,31 @@
         </w:tc>
         <w:tc>
           <w:tcPr>
-            <w:tcW w:w="3009" w:type="dxa"/>
-          </w:tcPr>
-          <w:p>
-            <w:r>
-              <w:t>Weak</w:t>
-            </w:r>
-          </w:p>
-        </w:tc>
-        <w:tc>
-          <w:tcPr>
-            <w:tcW w:w="3009" w:type="dxa"/>
-          </w:tcPr>
-          <w:p>
-            <w:r>
-              <w:t>none reliable</w:t>
+            <w:tcW w:w="2073" w:type="dxa"/>
+          </w:tcPr>
+          <w:p>
+            <w:r>
+              <w:t>Blind</w:t>
+            </w:r>
+          </w:p>
+        </w:tc>
+        <w:tc>
+          <w:tcPr>
+            <w:tcW w:w="2073" w:type="dxa"/>
+          </w:tcPr>
+          <w:p>
+            <w:r>
+              <w:t>Strong</w:t>
+            </w:r>
+          </w:p>
+        </w:tc>
+        <w:tc>
+          <w:tcPr>
+            <w:tcW w:w="3065" w:type="dxa"/>
+          </w:tcPr>
+          <w:p>
+            <w:r>
+              <w:t>CodeBLEU; the detector</w:t>
             </w:r>
           </w:p>
         </w:tc>
@@ -8669,7 +8777,7 @@
       <w:tr>
         <w:tc>
           <w:tcPr>
-            <w:tcW w:w="3009" w:type="dxa"/>
+            <w:tcW w:w="1803" w:type="dxa"/>
           </w:tcPr>
           <w:p>
             <w:r>
@@ -8679,7 +8787,7 @@
         </w:tc>
         <w:tc>
           <w:tcPr>
-            <w:tcW w:w="3009" w:type="dxa"/>
+            <w:tcW w:w="2073" w:type="dxa"/>
           </w:tcPr>
           <w:p>
             <w:r>
@@ -8689,11 +8797,21 @@
         </w:tc>
         <w:tc>
           <w:tcPr>
-            <w:tcW w:w="3009" w:type="dxa"/>
-          </w:tcPr>
-          <w:p>
-            <w:r>
-              <w:t>the smell detector only</w:t>
+            <w:tcW w:w="2073" w:type="dxa"/>
+          </w:tcPr>
+          <w:p>
+            <w:r>
+              <w:t>Strong</w:t>
+            </w:r>
+          </w:p>
+        </w:tc>
+        <w:tc>
+          <w:tcPr>
+            <w:tcW w:w="3065" w:type="dxa"/>
+          </w:tcPr>
+          <w:p>
+            <w:r>
+              <w:t>CodeBLEU / ROUGE-L; the detector</w:t>
             </w:r>
           </w:p>
         </w:tc>
@@ -8701,7 +8819,7 @@
       <w:tr>
         <w:tc>
           <w:tcPr>
-            <w:tcW w:w="3009" w:type="dxa"/>
+            <w:tcW w:w="1803" w:type="dxa"/>
           </w:tcPr>
           <w:p>
             <w:r>
@@ -8711,7 +8829,7 @@
         </w:tc>
         <w:tc>
           <w:tcPr>
-            <w:tcW w:w="3009" w:type="dxa"/>
+            <w:tcW w:w="2073" w:type="dxa"/>
           </w:tcPr>
           <w:p>
             <w:r>
@@ -8721,11 +8839,21 @@
         </w:tc>
         <w:tc>
           <w:tcPr>
-            <w:tcW w:w="3009" w:type="dxa"/>
-          </w:tcPr>
-          <w:p>
-            <w:r>
-              <w:t>the smell detector only</w:t>
+            <w:tcW w:w="2073" w:type="dxa"/>
+          </w:tcPr>
+          <w:p>
+            <w:r>
+              <w:t>Strong</w:t>
+            </w:r>
+          </w:p>
+        </w:tc>
+        <w:tc>
+          <w:tcPr>
+            <w:tcW w:w="3065" w:type="dxa"/>
+          </w:tcPr>
+          <w:p>
+            <w:r>
+              <w:t>BLEU / CodeBLEU; the detector</w:t>
             </w:r>
           </w:p>
         </w:tc>
@@ -8733,7 +8861,7 @@
       <w:tr>
         <w:tc>
           <w:tcPr>
-            <w:tcW w:w="3009" w:type="dxa"/>
+            <w:tcW w:w="1803" w:type="dxa"/>
           </w:tcPr>
           <w:p>
             <w:r>
@@ -8743,21 +8871,31 @@
         </w:tc>
         <w:tc>
           <w:tcPr>
-            <w:tcW w:w="3009" w:type="dxa"/>
-          </w:tcPr>
-          <w:p>
-            <w:r>
-              <w:t>Blind (needs clone detector)</w:t>
-            </w:r>
-          </w:p>
-        </w:tc>
-        <w:tc>
-          <w:tcPr>
-            <w:tcW w:w="3009" w:type="dxa"/>
-          </w:tcPr>
-          <w:p>
-            <w:r>
-              <w:t>jscpd only</w:t>
+            <w:tcW w:w="2073" w:type="dxa"/>
+          </w:tcPr>
+          <w:p>
+            <w:r>
+              <w:t>Blind (size)</w:t>
+            </w:r>
+          </w:p>
+        </w:tc>
+        <w:tc>
+          <w:tcPr>
+            <w:tcW w:w="2073" w:type="dxa"/>
+          </w:tcPr>
+          <w:p>
+            <w:r>
+              <w:t>Strong</w:t>
+            </w:r>
+          </w:p>
+        </w:tc>
+        <w:tc>
+          <w:tcPr>
+            <w:tcW w:w="3065" w:type="dxa"/>
+          </w:tcPr>
+          <w:p>
+            <w:r>
+              <w:t>jscpd; CodeBLEU vs. reference</w:t>
             </w:r>
           </w:p>
         </w:tc>
@@ -8765,18 +8903,23 @@
     </w:tbl>
     <w:p>
       <w:r>
-        <w:lastRenderedPageBreak/>
         <w:t>The pattern is clear. Maintainability is the most dependable single structural measure. The structural measures reliably catch the smells that make code physically bigger or more branched -- long methods, deep nesting, complex conditionals. For several others -- magic number, broad except, the loop-performance smells -- they show a moderate signal on real code, but through the size and complexity those smells co-occur with rather than the smell itself, so the signal is correlational, not specific. And three smells -- dead code, mutable default, long parameter list -- plus duplicate code cannot be seen by structure at all and must come from the detector.</w:t>
       </w:r>
     </w:p>
     <w:p>
+      <w:pPr/>
+      <w:r>
+        <w:t>The structural column is only half the table. Detectability depends on the measure family: the similarity column (BLEU, chrF, ROUGE-L, METEOR, CodeBLEU) separates every one of the twelve smells on the injected benchmark, including the four that structure cannot see. So a smell marked Blind is invisible to structure, not undetectable -- the similarity measures still register it as a divergence from its clean twin, and the detector still names it outright. What keeps similarity from being a universal detector is expanded below: it needs a clean reference, which freely generated code lacks, and it signals only that the code differs, not which smell it is. That is why the per-smell signal on model output comes from the detector, with the structural and similarity measures quantifying how far off, and in what way, the code is.</w:t>
+      </w:r>
+    </w:p>
+    <w:p>
       <w:r>
         <w:t>This is directly usable when the tool is run on model output, as it already is for the Qwen generations. The structural measures should be read as reliable evidence only for the bulky smells: high SLOC or complexity, or low maintainability, in generated code genuinely indicates long, nested or over-branched functions. But low structural scores must not be read as “clean” -- dead code, magic numbers, mutable defaults and long parameter lists can all be present with no structural signature. This is why the model evaluation runs the detectors directly and reports the smell rate from them, rather than inferring it from the structural numbers.</w:t>
       </w:r>
     </w:p>
     <w:p>
       <w:r>
-        <w:t>Two limitations should be stated plainly. First, the similarity measures (BLEU, chrF, ROUGE-L, METEOR, CodeBLEU) are validated on the injected data only: they compare code against a clean reference, which real naturally-occurring code does not have, so they cannot be checked on real code the way the structural measures were -- their reliability rests on the synthetic benchmark alone. Second, inefficient copy is sampled thinly on the real side (about ninety examples, since the anti-pattern is genuinely rare), so its real figures should be read with caution. Duplicate code, though it now has real examples too, is a reminder that a structural signal can be spurious: it shows up on both sources but is purely the size of the doubled snippet, so the real detector is the clone tool, not the structural measures.</w:t>
+        <w:t xml:space="preserve">Two limitations should be stated plainly. First, the similarity measures (BLEU, chrF, ROUGE-L, METEOR, CodeBLEU) are validated on the injected data only: they compare code against a clean reference, which real naturally-occurring code does not have, so they cannot be checked on real code the way the structural measures were -- their reliability rests on the synthetic benchmark alone. Second, inefficient copy is sampled thinly on the real side (about ninety examples, since the anti-pattern is genuinely rare), so its real figures should be read with caution. </w:t>
       </w:r>
     </w:p>
     <w:sectPr>
@@ -10513,6 +10656,7 @@
   <w:style w:type="character" w:default="1" w:styleId="DefaultParagraphFont">
     <w:name w:val="Default Paragraph Font"/>
     <w:uiPriority w:val="1"/>
+    <w:semiHidden/>
     <w:unhideWhenUsed/>
   </w:style>
   <w:style w:type="table" w:default="1" w:styleId="TableNormal">

</xml_diff>

<commit_message>
Fold the model measures into the detection report and the doc
Detection report: perplexity added to the reference-free (injected vs real)
table; CodeBERTScore + BERTScore added to the similarity table; notes updated
(perplexity near-zero throughout; the two model similarity measures separate
about as strongly as CodeBLEU). realworld_results.csv refreshed on ARC with
perplexity + cognitive/comment/api on real code. Doc: added the model-measure
results paragraph (CodeBERTScore/BERTScore strong; perplexity a useful negative
result) and completed the similarity-family lists.
</commit_message>
<xml_diff>
--- a/docs/Code Smells Research Kai v4.docx
+++ b/docs/Code Smells Research Kai v4.docx
@@ -8929,7 +8929,7 @@
     <w:p>
       <w:pPr/>
       <w:r>
-        <w:t>The structural column is only half the table. Detectability depends on the measure family: the similarity column (BLEU, chrF, ROUGE-L, METEOR, CodeBLEU) separates every one of the twelve smells on the injected benchmark, including the four that structure cannot see. So a smell marked Blind is invisible to structure, not undetectable -- the similarity measures still register it as a divergence from its clean twin, and the detector still names it outright. What keeps similarity from being a universal detector is expanded below: it needs a clean reference, which freely generated code lacks, and it signals only that the code differs, not which smell it is. That is why the per-smell signal on model output comes from the detector, with the structural and similarity measures quantifying how far off, and in what way, the code is.</w:t>
+        <w:t>The structural column is only half the table. Detectability depends on the measure family: the similarity column (BLEU, chrF, ROUGE-L, METEOR, CodeBLEU, AST similarity, CodeBERTScore, BERTScore) separates every one of the twelve smells on the injected benchmark, including the four that structure cannot see. So a smell marked Blind is invisible to structure, not undetectable -- the similarity measures still register it as a divergence from its clean twin, and the detector still names it outright. What keeps similarity from being a universal detector is expanded below: it needs a clean reference, which freely generated code lacks, and it signals only that the code differs, not which smell it is. That is why the per-smell signal on model output comes from the detector, with the structural and similarity measures quantifying how far off, and in what way, the code is.</w:t>
       </w:r>
     </w:p>
     <w:p>
@@ -8939,7 +8939,13 @@
     </w:p>
     <w:p>
       <w:r>
-        <w:t xml:space="preserve">Two limitations should be stated plainly. First, the similarity measures (BLEU, chrF, ROUGE-L, METEOR, CodeBLEU) are validated on the injected data only: they compare code against a clean reference, which real naturally-occurring code does not have, so they cannot be checked on real code the way the structural measures were -- their reliability rests on the synthetic benchmark alone. Second, inefficient copy is sampled thinly on the real side (about ninety examples, since the anti-pattern is genuinely rare), so its real figures should be read with caution. </w:t>
+        <w:t xml:space="preserve">Two limitations should be stated plainly. First, the similarity measures (BLEU, CodeBLEU, CodeBERTScore, BERTScore and the rest) are validated on the injected data only: they compare code against a clean reference, which real naturally-occurring code does not have, so they cannot be checked on real code the way the structural measures were -- their reliability rests on the synthetic benchmark alone. Second, inefficient copy is sampled thinly on the real side (about ninety examples, since the anti-pattern is genuinely rare), so its real figures should be read with caution. </w:t>
+      </w:r>
+    </w:p>
+    <w:p>
+      <w:pPr/>
+      <w:r>
+        <w:t>The three model-based measures have now been run on a GPU (Oxford ARC), over both the benchmark and the model’s generations. The two reference-based ones — CodeBERTScore and BERTScore — separate smelly from clean about as strongly as CodeBLEU (detection strength roughly three to five), so they join the similarity family and inherit its limitation: they need a clean reference and are validated on the injected set only. Perplexity, the reference-free one, is the exception — its detection strength stays near zero on both the injected and the real data, so a code language model does not find smelly code more “surprising” than clean code. That is a useful negative result: naturalness, as a language model scores it, is not a proxy for structural quality. It also shows up on the model’s own output — Qwen’s generated code is slightly less perplexing than the canonical solutions, and far more heavily commented.</w:t>
       </w:r>
     </w:p>
     <w:sectPr>

</xml_diff>